<commit_message>
feat(team-communication): match lab 3 report to the Trello board
Fill in the lab 4 team members and rewrite sections 2.2-2.5 from the
real board: who created it, the three cards with their due dates, the
single comment and the activity feed. Replace the screenshot
placeholders with five board screenshots and align table 2 and the
conclusions with what the board shows.

Co-Authored-By: Claude Opus 5.5 <noreply@anthropic.com>
</commit_message>
<xml_diff>
--- a/Year 1/Командна комунікація в ІТ-проєктах/Звіт_3.docx
+++ b/Year 1/Командна комунікація в ІТ-проєктах/Звіт_3.docx
@@ -633,9 +633,7 @@
             <w:bottom w:w="0" w:type="dxa"/>
           </w:tblCellMar>
         </w:tblPrEx>
-        <w:trPr>
-          <w:cantSplit/>
-        </w:trPr>
+        <w:trPr/>
         <w:tc>
           <w:tcPr>
             <w:tcW w:w="1100" w:type="dxa"/>
@@ -914,9 +912,7 @@
             <w:bottom w:w="0" w:type="dxa"/>
           </w:tblCellMar>
         </w:tblPrEx>
-        <w:trPr>
-          <w:cantSplit/>
-        </w:trPr>
+        <w:trPr/>
         <w:tc>
           <w:tcPr>
             <w:tcW w:w="1100" w:type="dxa"/>
@@ -1195,9 +1191,7 @@
             <w:bottom w:w="0" w:type="dxa"/>
           </w:tblCellMar>
         </w:tblPrEx>
-        <w:trPr>
-          <w:cantSplit/>
-        </w:trPr>
+        <w:trPr/>
         <w:tc>
           <w:tcPr>
             <w:tcW w:w="1100" w:type="dxa"/>
@@ -1476,9 +1470,7 @@
             <w:bottom w:w="0" w:type="dxa"/>
           </w:tblCellMar>
         </w:tblPrEx>
-        <w:trPr>
-          <w:cantSplit/>
-        </w:trPr>
+        <w:trPr/>
         <w:tc>
           <w:tcPr>
             <w:tcW w:w="1100" w:type="dxa"/>
@@ -1757,9 +1749,7 @@
             <w:bottom w:w="0" w:type="dxa"/>
           </w:tblCellMar>
         </w:tblPrEx>
-        <w:trPr>
-          <w:cantSplit/>
-        </w:trPr>
+        <w:trPr/>
         <w:tc>
           <w:tcPr>
             <w:tcW w:w="1100" w:type="dxa"/>
@@ -2038,9 +2028,7 @@
             <w:bottom w:w="0" w:type="dxa"/>
           </w:tblCellMar>
         </w:tblPrEx>
-        <w:trPr>
-          <w:cantSplit/>
-        </w:trPr>
+        <w:trPr/>
         <w:tc>
           <w:tcPr>
             <w:tcW w:w="1100" w:type="dxa"/>
@@ -2319,9 +2307,7 @@
             <w:bottom w:w="0" w:type="dxa"/>
           </w:tblCellMar>
         </w:tblPrEx>
-        <w:trPr>
-          <w:cantSplit/>
-        </w:trPr>
+        <w:trPr/>
         <w:tc>
           <w:tcPr>
             <w:tcW w:w="1100" w:type="dxa"/>
@@ -2600,9 +2586,7 @@
             <w:bottom w:w="0" w:type="dxa"/>
           </w:tblCellMar>
         </w:tblPrEx>
-        <w:trPr>
-          <w:cantSplit/>
-        </w:trPr>
+        <w:trPr/>
         <w:tc>
           <w:tcPr>
             <w:tcW w:w="1100" w:type="dxa"/>
@@ -3049,9 +3033,7 @@
             <w:bottom w:w="0" w:type="dxa"/>
           </w:tblCellMar>
         </w:tblPrEx>
-        <w:trPr>
-          <w:cantSplit/>
-        </w:trPr>
+        <w:trPr/>
         <w:tc>
           <w:tcPr>
             <w:tcW w:w="2300" w:type="dxa"/>
@@ -3135,7 +3117,7 @@
                 <w:sz w:val="24"/>
                 <w:szCs w:val="24"/>
               </w:rPr>
-              <w:t>Декомпозиція задачі на картки, призначення виконавців, контроль дедлайнів</w:t>
+              <w:t>Структура інтерфейсу та концепт застосунку, виконання завдань карток</w:t>
             </w:r>
           </w:p>
         </w:tc>
@@ -3147,9 +3129,7 @@
             <w:bottom w:w="0" w:type="dxa"/>
           </w:tblCellMar>
         </w:tblPrEx>
-        <w:trPr>
-          <w:cantSplit/>
-        </w:trPr>
+        <w:trPr/>
         <w:tc>
           <w:tcPr>
             <w:tcW w:w="2300" w:type="dxa"/>
@@ -3172,9 +3152,10 @@
             </w:pPr>
             <w:r>
               <w:rPr>
-                <w:highlight w:val="yellow"/>
-              </w:rPr>
-              <w:t>[ПІБ учасника 2]</w:t>
+                <w:sz w:val="24"/>
+                <w:szCs w:val="24"/>
+              </w:rPr>
+              <w:t>Вітер Нікіта</w:t>
             </w:r>
           </w:p>
         </w:tc>
@@ -3203,7 +3184,7 @@
                 <w:sz w:val="24"/>
                 <w:szCs w:val="24"/>
               </w:rPr>
-              <w:t>III — генератор ідей</w:t>
+              <w:t>I — голова (керівник групи)</w:t>
             </w:r>
           </w:p>
         </w:tc>
@@ -3232,7 +3213,7 @@
                 <w:sz w:val="24"/>
                 <w:szCs w:val="24"/>
               </w:rPr>
-              <w:t>Пропозиції щодо концепції застосунку, наповнення карток ідеями</w:t>
+              <w:t>Декомпозиція завдання на картки, призначення учасників і дедлайнів, доручення в коментарях</w:t>
             </w:r>
           </w:p>
         </w:tc>
@@ -3244,9 +3225,7 @@
             <w:bottom w:w="0" w:type="dxa"/>
           </w:tblCellMar>
         </w:tblPrEx>
-        <w:trPr>
-          <w:cantSplit/>
-        </w:trPr>
+        <w:trPr/>
         <w:tc>
           <w:tcPr>
             <w:tcW w:w="2300" w:type="dxa"/>
@@ -3269,9 +3248,10 @@
             </w:pPr>
             <w:r>
               <w:rPr>
-                <w:highlight w:val="yellow"/>
-              </w:rPr>
-              <w:t>[ПІБ учасника 3]</w:t>
+                <w:sz w:val="24"/>
+                <w:szCs w:val="24"/>
+              </w:rPr>
+              <w:t>Блохін В. О.</w:t>
             </w:r>
           </w:p>
         </w:tc>
@@ -3300,7 +3280,7 @@
                 <w:sz w:val="24"/>
                 <w:szCs w:val="24"/>
               </w:rPr>
-              <w:t>IV — аналітик (оцінювач ідей)</w:t>
+              <w:t>III — генератор ідей</w:t>
             </w:r>
           </w:p>
         </w:tc>
@@ -3329,7 +3309,7 @@
                 <w:sz w:val="24"/>
                 <w:szCs w:val="24"/>
               </w:rPr>
-              <w:t>Критичний відбір ідей, перевірка реалістичності плану</w:t>
+              <w:t>Пропозиції щодо концепції застосунку, наповнення карток ідеями</w:t>
             </w:r>
           </w:p>
         </w:tc>
@@ -3341,9 +3321,7 @@
             <w:bottom w:w="0" w:type="dxa"/>
           </w:tblCellMar>
         </w:tblPrEx>
-        <w:trPr>
-          <w:cantSplit/>
-        </w:trPr>
+        <w:trPr/>
         <w:tc>
           <w:tcPr>
             <w:tcW w:w="2300" w:type="dxa"/>
@@ -3366,9 +3344,10 @@
             </w:pPr>
             <w:r>
               <w:rPr>
-                <w:highlight w:val="yellow"/>
-              </w:rPr>
-              <w:t>[ПІБ учасника 4]</w:t>
+                <w:sz w:val="24"/>
+                <w:szCs w:val="24"/>
+              </w:rPr>
+              <w:t>Какапич М. В.</w:t>
             </w:r>
           </w:p>
         </w:tc>
@@ -3397,7 +3376,7 @@
                 <w:sz w:val="24"/>
                 <w:szCs w:val="24"/>
               </w:rPr>
-              <w:t>VIII — завершувач</w:t>
+              <w:t>IV — аналітик (оцінювач ідей)</w:t>
             </w:r>
           </w:p>
         </w:tc>
@@ -3426,61 +3405,11 @@
                 <w:sz w:val="24"/>
                 <w:szCs w:val="24"/>
               </w:rPr>
-              <w:t>Контроль чеклістів, доведення карток до статусу Done</w:t>
+              <w:t>Критичний відбір ідей, перевірка реалістичності плану</w:t>
             </w:r>
           </w:p>
         </w:tc>
       </w:tr>
-    </w:tbl>
-    <w:p>
-      <w:pPr>
-        <w:spacing w:line="360" w:lineRule="auto"/>
-      </w:pPr>
-    </w:p>
-    <w:p>
-      <w:pPr>
-        <w:keepNext/>
-        <w:spacing w:before="240" w:after="120" w:line="360" w:lineRule="auto"/>
-        <w:ind w:firstLine="709"/>
-      </w:pPr>
-      <w:r>
-        <w:rPr>
-          <w:b/>
-          <w:bCs/>
-        </w:rPr>
-        <w:t>2.2. Реєстрація в Trello та створення дошки</w:t>
-      </w:r>
-    </w:p>
-    <w:p>
-      <w:pPr>
-        <w:spacing w:line="360" w:lineRule="auto"/>
-        <w:ind w:firstLine="709"/>
-        <w:jc w:val="both"/>
-      </w:pPr>
-      <w:r>
-        <w:t>Кожен учасник команди зареєстрував обліковий запис у Trello через акаунт Google. Координатор створив робочий простір команди та дошку з назвою «Командна робота ЛР-3», після чого запросив решту учасників за електронною поштою (рис. 1).</w:t>
-      </w:r>
-    </w:p>
-    <w:tbl>
-      <w:tblPr>
-        <w:tblW w:w="9354" w:type="dxa"/>
-        <w:tblBorders>
-          <w:top w:val="single" w:sz="4" w:space="0" w:color="auto"/>
-          <w:left w:val="single" w:sz="4" w:space="0" w:color="auto"/>
-          <w:bottom w:val="single" w:sz="4" w:space="0" w:color="auto"/>
-          <w:right w:val="single" w:sz="4" w:space="0" w:color="auto"/>
-          <w:insideH w:val="single" w:sz="4" w:space="0" w:color="auto"/>
-          <w:insideV w:val="single" w:sz="4" w:space="0" w:color="auto"/>
-        </w:tblBorders>
-        <w:tblCellMar>
-          <w:left w:w="10" w:type="dxa"/>
-          <w:right w:w="10" w:type="dxa"/>
-        </w:tblCellMar>
-        <w:tblLook w:val="04A0" w:firstRow="1" w:lastRow="0" w:firstColumn="1" w:lastColumn="0" w:noHBand="0" w:noVBand="1"/>
-      </w:tblPr>
-      <w:tblGrid>
-        <w:gridCol w:w="9354"/>
-      </w:tblGrid>
       <w:tr>
         <w:tblPrEx>
           <w:tblCellMar>
@@ -3488,48 +3417,91 @@
             <w:bottom w:w="0" w:type="dxa"/>
           </w:tblCellMar>
         </w:tblPrEx>
-        <w:tc>
-          <w:tcPr>
-            <w:tcW w:w="9354" w:type="dxa"/>
-            <w:tcBorders>
-              <w:top w:val="dashed" w:sz="8" w:space="0" w:color="C00000"/>
-              <w:left w:val="dashed" w:sz="8" w:space="0" w:color="C00000"/>
-              <w:bottom w:val="dashed" w:sz="8" w:space="0" w:color="C00000"/>
-              <w:right w:val="dashed" w:sz="8" w:space="0" w:color="C00000"/>
-            </w:tcBorders>
-            <w:tcMar>
-              <w:top w:w="700" w:type="dxa"/>
-              <w:left w:w="200" w:type="dxa"/>
-              <w:bottom w:w="700" w:type="dxa"/>
-              <w:right w:w="200" w:type="dxa"/>
-            </w:tcMar>
-          </w:tcPr>
-          <w:p>
-            <w:pPr>
-              <w:spacing w:line="360" w:lineRule="auto"/>
-              <w:jc w:val="center"/>
-            </w:pPr>
-            <w:r>
-              <w:rPr>
-                <w:b/>
-                <w:bCs/>
-                <w:color w:val="C00000"/>
-              </w:rPr>
-              <w:t>ВСТАВИТИ СКРИНШОТ</w:t>
-            </w:r>
-          </w:p>
-          <w:p>
-            <w:pPr>
-              <w:spacing w:line="360" w:lineRule="auto"/>
-              <w:jc w:val="center"/>
-            </w:pPr>
-            <w:r>
-              <w:rPr>
-                <w:color w:val="C00000"/>
-                <w:sz w:val="24"/>
-                <w:szCs w:val="24"/>
-              </w:rPr>
-              <w:t>Скриншот дошки Trello: назва дошки, аватари всіх учасників у шапці</w:t>
+        <w:trPr/>
+        <w:tc>
+          <w:tcPr>
+            <w:tcW w:w="2300" w:type="dxa"/>
+            <w:tcBorders>
+              <w:top w:val="single" w:sz="4" w:space="0" w:color="000000"/>
+              <w:left w:val="single" w:sz="4" w:space="0" w:color="000000"/>
+              <w:bottom w:val="single" w:sz="4" w:space="0" w:color="000000"/>
+              <w:right w:val="single" w:sz="4" w:space="0" w:color="000000"/>
+            </w:tcBorders>
+            <w:tcMar>
+              <w:top w:w="40" w:type="dxa"/>
+              <w:left w:w="80" w:type="dxa"/>
+              <w:bottom w:w="40" w:type="dxa"/>
+              <w:right w:w="80" w:type="dxa"/>
+            </w:tcMar>
+          </w:tcPr>
+          <w:p>
+            <w:pPr>
+              <w:spacing w:line="276" w:lineRule="auto"/>
+            </w:pPr>
+            <w:r>
+              <w:rPr>
+                <w:sz w:val="24"/>
+                <w:szCs w:val="24"/>
+              </w:rPr>
+              <w:t>Кащин С. Р.</w:t>
+            </w:r>
+          </w:p>
+        </w:tc>
+        <w:tc>
+          <w:tcPr>
+            <w:tcW w:w="3300" w:type="dxa"/>
+            <w:tcBorders>
+              <w:top w:val="single" w:sz="4" w:space="0" w:color="000000"/>
+              <w:left w:val="single" w:sz="4" w:space="0" w:color="000000"/>
+              <w:bottom w:val="single" w:sz="4" w:space="0" w:color="000000"/>
+              <w:right w:val="single" w:sz="4" w:space="0" w:color="000000"/>
+            </w:tcBorders>
+            <w:tcMar>
+              <w:top w:w="40" w:type="dxa"/>
+              <w:left w:w="80" w:type="dxa"/>
+              <w:bottom w:w="40" w:type="dxa"/>
+              <w:right w:w="80" w:type="dxa"/>
+            </w:tcMar>
+          </w:tcPr>
+          <w:p>
+            <w:pPr>
+              <w:spacing w:line="276" w:lineRule="auto"/>
+            </w:pPr>
+            <w:r>
+              <w:rPr>
+                <w:sz w:val="24"/>
+                <w:szCs w:val="24"/>
+              </w:rPr>
+              <w:t>VIII — завершувач</w:t>
+            </w:r>
+          </w:p>
+        </w:tc>
+        <w:tc>
+          <w:tcPr>
+            <w:tcW w:w="3754" w:type="dxa"/>
+            <w:tcBorders>
+              <w:top w:val="single" w:sz="4" w:space="0" w:color="000000"/>
+              <w:left w:val="single" w:sz="4" w:space="0" w:color="000000"/>
+              <w:bottom w:val="single" w:sz="4" w:space="0" w:color="000000"/>
+              <w:right w:val="single" w:sz="4" w:space="0" w:color="000000"/>
+            </w:tcBorders>
+            <w:tcMar>
+              <w:top w:w="40" w:type="dxa"/>
+              <w:left w:w="80" w:type="dxa"/>
+              <w:bottom w:w="40" w:type="dxa"/>
+              <w:right w:w="80" w:type="dxa"/>
+            </w:tcMar>
+          </w:tcPr>
+          <w:p>
+            <w:pPr>
+              <w:spacing w:line="276" w:lineRule="auto"/>
+            </w:pPr>
+            <w:r>
+              <w:rPr>
+                <w:sz w:val="24"/>
+                <w:szCs w:val="24"/>
+              </w:rPr>
+              <w:t>Створення дошки та списків, доведення карток до статусу Done</w:t>
             </w:r>
           </w:p>
         </w:tc>
@@ -3537,22 +3509,8 @@
     </w:tbl>
     <w:p>
       <w:pPr>
-        <w:spacing w:before="120" w:after="240" w:line="360" w:lineRule="auto"/>
-        <w:jc w:val="center"/>
-      </w:pPr>
-      <w:r>
-        <w:t>Рисунок 1 — Дошка «Командна робота ЛР-3» з учасниками команди</w:t>
-      </w:r>
-    </w:p>
-    <w:p>
-      <w:pPr>
         <w:spacing w:line="360" w:lineRule="auto"/>
-        <w:ind w:firstLine="709"/>
-        <w:jc w:val="both"/>
-      </w:pPr>
-      <w:r>
-        <w:t>На дошці створено три списки, що відповідають статусам завдань: «To Do» (заплановані завдання), «In Progress» (виконуються) та «Done» (завершені). Така структура реалізує канбан-підхід: картка проходить списки зліва направо в міру виконання.</w:t>
-      </w:r>
+      </w:pPr>
     </w:p>
     <w:p>
       <w:pPr>
@@ -3565,8 +3523,7 @@
           <w:b/>
           <w:bCs/>
         </w:rPr>
-        <w:lastRenderedPageBreak/>
-        <w:t>2.3. Розподіл завдань у вигляді карток</w:t>
+        <w:t>2.2. Створення дошки та учасники</w:t>
       </w:r>
     </w:p>
     <w:p>
@@ -3576,12 +3533,155 @@
         <w:jc w:val="both"/>
       </w:pPr>
       <w:r>
-        <w:t>Із запропонованого переліку команда обрала два завдання: «Розробити навчальний проєкт “Мій ідеальний застосунок”» та «Організувати план зустрічі студентської команди». Для кожного завдання створено картки з виконавцями, дедлайнами та чеклістами (табл. 3).</w:t>
+        <w:t xml:space="preserve">Дошку для командної роботи створив Кащин С. Р. 22.09.2026 і запросив до неї решту учасників; до дошки приєдналися всі п’ять членів команди. Спершу дошка мала робочу назву «LAB03 Grupa3», 12.10.2026 Вітер Нікіта перейменував її на «Командна робота ЛР-3» (рис. 1).</w:t>
+      </w:r>
+    </w:p>
+    <w:p>
+      <w:pPr>
+        <w:keepNext/>
+        <w:spacing w:before="120" w:line="240" w:lineRule="auto"/>
+        <w:jc w:val="center"/>
+      </w:pPr>
+      <w:r>
+        <w:drawing>
+          <wp:inline distT="0" distB="0" distL="0" distR="0">
+            <wp:extent cx="5940000" cy="1560508"/>
+            <wp:docPr id="101" name="trello_fig1.png"/>
+            <a:graphic xmlns:a="http://schemas.openxmlformats.org/drawingml/2006/main">
+              <a:graphicData uri="http://schemas.openxmlformats.org/drawingml/2006/picture">
+                <pic:pic xmlns:pic="http://schemas.openxmlformats.org/drawingml/2006/picture">
+                  <pic:nvPicPr>
+                    <pic:cNvPr id="101" name="trello_fig1.png"/>
+                    <pic:cNvPicPr/>
+                  </pic:nvPicPr>
+                  <pic:blipFill>
+                    <a:blip r:embed="rIdTrellofig1"/>
+                    <a:stretch>
+                      <a:fillRect/>
+                    </a:stretch>
+                  </pic:blipFill>
+                  <pic:spPr>
+                    <a:xfrm>
+                      <a:off x="0" y="0"/>
+                      <a:ext cx="5940000" cy="1560508"/>
+                    </a:xfrm>
+                    <a:prstGeom prst="rect">
+                      <a:avLst/>
+                    </a:prstGeom>
+                    <a:ln w="6350">
+                      <a:solidFill>
+                        <a:srgbClr val="808080"/>
+                      </a:solidFill>
+                    </a:ln>
+                  </pic:spPr>
+                </pic:pic>
+              </a:graphicData>
+            </a:graphic>
+          </wp:inline>
+        </w:drawing>
+      </w:r>
+    </w:p>
+    <w:p>
+      <w:pPr>
+        <w:spacing w:before="120" w:after="240" w:line="360" w:lineRule="auto"/>
+        <w:jc w:val="center"/>
+      </w:pPr>
+      <w:r>
+        <w:t>Рисунок 1 — Дошка «Командна робота ЛР-3» з учасниками команди</w:t>
       </w:r>
     </w:p>
     <w:p>
       <w:pPr>
         <w:spacing w:line="360" w:lineRule="auto"/>
+        <w:ind w:firstLine="709"/>
+        <w:jc w:val="both"/>
+      </w:pPr>
+      <w:r>
+        <w:t xml:space="preserve">Кащин С. Р. створив на дошці три списки, що відповідають статусам завдань: «To Do» (заплановані завдання), «In progress» (виконуються) та «Done» (завершені). Така структура реалізує канбан-підхід: картка проходить списки зліва направо в міру виконання.</w:t>
+      </w:r>
+    </w:p>
+    <w:p>
+      <w:pPr>
+        <w:keepNext/>
+        <w:spacing w:before="240" w:after="120" w:line="360" w:lineRule="auto"/>
+        <w:ind w:firstLine="709"/>
+      </w:pPr>
+      <w:r>
+        <w:rPr>
+          <w:b/>
+          <w:bCs/>
+        </w:rPr>
+        <w:t>2.3. Розподіл завдань у вигляді карток</w:t>
+      </w:r>
+    </w:p>
+    <w:p>
+      <w:pPr>
+        <w:spacing w:line="360" w:lineRule="auto"/>
+        <w:ind w:firstLine="709"/>
+        <w:jc w:val="both"/>
+      </w:pPr>
+      <w:r>
+        <w:t xml:space="preserve">Спочатку Блохін В. О. 06.10.2026 додав на дошку картки для двох завдань із запропонованого переліку — «Розробити план для поїздки в гори» та «План святкування Дня студента». Згодом команда зупинилася на завданні «Розробити навчальний проєкт “Мій ідеальний застосунок”», і 19.10.2026 Вітер Нікіта як керівник групи переробив дошку під нього: розбив завдання на три етапи-картки, призначив на кожну всіх учасників команди та встановив дедлайни; попередні картки перенесено в архів (табл. 3, рис. 2). Чеклісти й мітки на картках не використовувалися.</w:t>
+      </w:r>
+    </w:p>
+    <w:p>
+      <w:pPr>
+        <w:keepNext/>
+        <w:spacing w:before="120" w:line="240" w:lineRule="auto"/>
+        <w:jc w:val="center"/>
+      </w:pPr>
+      <w:r>
+        <w:drawing>
+          <wp:inline distT="0" distB="0" distL="0" distR="0">
+            <wp:extent cx="3240000" cy="2781116"/>
+            <wp:docPr id="102" name="trello_fig2.png"/>
+            <a:graphic xmlns:a="http://schemas.openxmlformats.org/drawingml/2006/main">
+              <a:graphicData uri="http://schemas.openxmlformats.org/drawingml/2006/picture">
+                <pic:pic xmlns:pic="http://schemas.openxmlformats.org/drawingml/2006/picture">
+                  <pic:nvPicPr>
+                    <pic:cNvPr id="102" name="trello_fig2.png"/>
+                    <pic:cNvPicPr/>
+                  </pic:nvPicPr>
+                  <pic:blipFill>
+                    <a:blip r:embed="rIdTrellofig2"/>
+                    <a:stretch>
+                      <a:fillRect/>
+                    </a:stretch>
+                  </pic:blipFill>
+                  <pic:spPr>
+                    <a:xfrm>
+                      <a:off x="0" y="0"/>
+                      <a:ext cx="3240000" cy="2781116"/>
+                    </a:xfrm>
+                    <a:prstGeom prst="rect">
+                      <a:avLst/>
+                    </a:prstGeom>
+                    <a:ln w="6350">
+                      <a:solidFill>
+                        <a:srgbClr val="808080"/>
+                      </a:solidFill>
+                    </a:ln>
+                  </pic:spPr>
+                </pic:pic>
+              </a:graphicData>
+            </a:graphic>
+          </wp:inline>
+        </w:drawing>
+      </w:r>
+    </w:p>
+    <w:p>
+      <w:pPr>
+        <w:spacing w:before="120" w:after="240" w:line="360" w:lineRule="auto"/>
+        <w:jc w:val="center"/>
+      </w:pPr>
+      <w:r>
+        <w:t>Рисунок 2 — Картка «Розподіл ролей…» з учасниками та датою завершення</w:t>
+      </w:r>
+    </w:p>
+    <w:p>
+      <w:pPr>
+        <w:keepNext/>
+        <w:spacing w:before="120" w:line="360" w:lineRule="auto"/>
         <w:jc w:val="center"/>
       </w:pPr>
       <w:r>
@@ -3717,7 +3817,7 @@
                 <w:sz w:val="24"/>
                 <w:szCs w:val="24"/>
               </w:rPr>
-              <w:t>Виконавець</w:t>
+              <w:t>Виконавці</w:t>
             </w:r>
           </w:p>
         </w:tc>
@@ -3783,7 +3883,7 @@
                 <w:sz w:val="24"/>
                 <w:szCs w:val="24"/>
               </w:rPr>
-              <w:t>Чекліст / мітка</w:t>
+              <w:t>Коментарі</w:t>
             </w:r>
           </w:p>
         </w:tc>
@@ -3795,9 +3895,7 @@
             <w:bottom w:w="0" w:type="dxa"/>
           </w:tblCellMar>
         </w:tblPrEx>
-        <w:trPr>
-          <w:cantSplit/>
-        </w:trPr>
+        <w:trPr/>
         <w:tc>
           <w:tcPr>
             <w:tcW w:w="3000" w:type="dxa"/>
@@ -3823,7 +3921,7 @@
                 <w:sz w:val="24"/>
                 <w:szCs w:val="24"/>
               </w:rPr>
-              <w:t>Пройти тест Белбіна й занести роль у картку</w:t>
+              <w:t xml:space="preserve">Визначити цільову аудиторію, обрати мову програмування для логіки (наприклад, C++), накидати структуру інтерфейсу</w:t>
             </w:r>
           </w:p>
         </w:tc>
@@ -3852,7 +3950,7 @@
                 <w:sz w:val="24"/>
                 <w:szCs w:val="24"/>
               </w:rPr>
-              <w:t>Done</w:t>
+              <w:t xml:space="preserve">To Do</w:t>
             </w:r>
           </w:p>
         </w:tc>
@@ -3881,7 +3979,7 @@
                 <w:sz w:val="24"/>
                 <w:szCs w:val="24"/>
               </w:rPr>
-              <w:t>усі учасники</w:t>
+              <w:t xml:space="preserve">усі учасники</w:t>
             </w:r>
           </w:p>
         </w:tc>
@@ -3907,9 +4005,10 @@
             </w:pPr>
             <w:r>
               <w:rPr>
-                <w:highlight w:val="yellow"/>
-              </w:rPr>
-              <w:t>[дата]</w:t>
+                <w:sz w:val="24"/>
+                <w:szCs w:val="24"/>
+              </w:rPr>
+              <w:t xml:space="preserve">22.09.2026</w:t>
             </w:r>
           </w:p>
         </w:tc>
@@ -3938,7 +4037,7 @@
                 <w:sz w:val="24"/>
                 <w:szCs w:val="24"/>
               </w:rPr>
-              <w:t>«Командні кроки»: тест, дані, коментар, завдання</w:t>
+              <w:t xml:space="preserve">—</w:t>
             </w:r>
           </w:p>
         </w:tc>
@@ -3950,9 +4049,7 @@
             <w:bottom w:w="0" w:type="dxa"/>
           </w:tblCellMar>
         </w:tblPrEx>
-        <w:trPr>
-          <w:cantSplit/>
-        </w:trPr>
+        <w:trPr/>
         <w:tc>
           <w:tcPr>
             <w:tcW w:w="3000" w:type="dxa"/>
@@ -3978,7 +4075,7 @@
                 <w:sz w:val="24"/>
                 <w:szCs w:val="24"/>
               </w:rPr>
-              <w:t>Скласти порядок денний зустрічі команди</w:t>
+              <w:t xml:space="preserve">Розподіл ролей (хто пише технічне завдання, хто збирає референси щодо дизайну), створення презентації</w:t>
             </w:r>
           </w:p>
         </w:tc>
@@ -4007,7 +4104,7 @@
                 <w:sz w:val="24"/>
                 <w:szCs w:val="24"/>
               </w:rPr>
-              <w:t>Done</w:t>
+              <w:t xml:space="preserve">In progress</w:t>
             </w:r>
           </w:p>
         </w:tc>
@@ -4036,7 +4133,7 @@
                 <w:sz w:val="24"/>
                 <w:szCs w:val="24"/>
               </w:rPr>
-              <w:t>Бойчук А. А.</w:t>
+              <w:t xml:space="preserve">усі учасники</w:t>
             </w:r>
           </w:p>
         </w:tc>
@@ -4062,9 +4159,10 @@
             </w:pPr>
             <w:r>
               <w:rPr>
-                <w:highlight w:val="yellow"/>
-              </w:rPr>
-              <w:t>[дата]</w:t>
+                <w:sz w:val="24"/>
+                <w:szCs w:val="24"/>
+              </w:rPr>
+              <w:t xml:space="preserve">24.09.2026</w:t>
             </w:r>
           </w:p>
         </w:tc>
@@ -4093,7 +4191,7 @@
                 <w:sz w:val="24"/>
                 <w:szCs w:val="24"/>
               </w:rPr>
-              <w:t>мітка «Зустріч»</w:t>
+              <w:t xml:space="preserve">1</w:t>
             </w:r>
           </w:p>
         </w:tc>
@@ -4105,9 +4203,7 @@
             <w:bottom w:w="0" w:type="dxa"/>
           </w:tblCellMar>
         </w:tblPrEx>
-        <w:trPr>
-          <w:cantSplit/>
-        </w:trPr>
+        <w:trPr/>
         <w:tc>
           <w:tcPr>
             <w:tcW w:w="3000" w:type="dxa"/>
@@ -4133,7 +4229,7 @@
                 <w:sz w:val="24"/>
                 <w:szCs w:val="24"/>
               </w:rPr>
-              <w:t>Підготувати завдання для кожного учасника до зустрічі</w:t>
+              <w:t xml:space="preserve">Затвердження концепту додатка, фінальна вичитка презентації</w:t>
             </w:r>
           </w:p>
         </w:tc>
@@ -4162,7 +4258,7 @@
                 <w:sz w:val="24"/>
                 <w:szCs w:val="24"/>
               </w:rPr>
-              <w:t>In Progress</w:t>
+              <w:t xml:space="preserve">Done</w:t>
             </w:r>
           </w:p>
         </w:tc>
@@ -4188,9 +4284,10 @@
             </w:pPr>
             <w:r>
               <w:rPr>
-                <w:highlight w:val="yellow"/>
-              </w:rPr>
-              <w:t>[учасник 2]</w:t>
+                <w:sz w:val="24"/>
+                <w:szCs w:val="24"/>
+              </w:rPr>
+              <w:t xml:space="preserve">усі учасники</w:t>
             </w:r>
           </w:p>
         </w:tc>
@@ -4216,9 +4313,10 @@
             </w:pPr>
             <w:r>
               <w:rPr>
-                <w:highlight w:val="yellow"/>
-              </w:rPr>
-              <w:t>[дата]</w:t>
+                <w:sz w:val="24"/>
+                <w:szCs w:val="24"/>
+              </w:rPr>
+              <w:t xml:space="preserve">25.09.2026</w:t>
             </w:r>
           </w:p>
         </w:tc>
@@ -4247,717 +4345,12 @@
                 <w:sz w:val="24"/>
                 <w:szCs w:val="24"/>
               </w:rPr>
-              <w:t>чекліст з 4 пунктів</w:t>
-            </w:r>
-          </w:p>
-        </w:tc>
-      </w:tr>
-      <w:tr>
-        <w:tblPrEx>
-          <w:tblCellMar>
-            <w:top w:w="0" w:type="dxa"/>
-            <w:bottom w:w="0" w:type="dxa"/>
-          </w:tblCellMar>
-        </w:tblPrEx>
-        <w:trPr>
-          <w:cantSplit/>
-        </w:trPr>
-        <w:tc>
-          <w:tcPr>
-            <w:tcW w:w="3000" w:type="dxa"/>
-            <w:tcBorders>
-              <w:top w:val="single" w:sz="4" w:space="0" w:color="000000"/>
-              <w:left w:val="single" w:sz="4" w:space="0" w:color="000000"/>
-              <w:bottom w:val="single" w:sz="4" w:space="0" w:color="000000"/>
-              <w:right w:val="single" w:sz="4" w:space="0" w:color="000000"/>
-            </w:tcBorders>
-            <w:tcMar>
-              <w:top w:w="40" w:type="dxa"/>
-              <w:left w:w="80" w:type="dxa"/>
-              <w:bottom w:w="40" w:type="dxa"/>
-              <w:right w:w="80" w:type="dxa"/>
-            </w:tcMar>
-          </w:tcPr>
-          <w:p>
-            <w:pPr>
-              <w:spacing w:line="276" w:lineRule="auto"/>
-            </w:pPr>
-            <w:r>
-              <w:rPr>
-                <w:sz w:val="24"/>
-                <w:szCs w:val="24"/>
-              </w:rPr>
-              <w:t>Згенерувати ідеї застосунку (не менше 5)</w:t>
-            </w:r>
-          </w:p>
-        </w:tc>
-        <w:tc>
-          <w:tcPr>
-            <w:tcW w:w="1300" w:type="dxa"/>
-            <w:tcBorders>
-              <w:top w:val="single" w:sz="4" w:space="0" w:color="000000"/>
-              <w:left w:val="single" w:sz="4" w:space="0" w:color="000000"/>
-              <w:bottom w:val="single" w:sz="4" w:space="0" w:color="000000"/>
-              <w:right w:val="single" w:sz="4" w:space="0" w:color="000000"/>
-            </w:tcBorders>
-            <w:tcMar>
-              <w:top w:w="40" w:type="dxa"/>
-              <w:left w:w="80" w:type="dxa"/>
-              <w:bottom w:w="40" w:type="dxa"/>
-              <w:right w:w="80" w:type="dxa"/>
-            </w:tcMar>
-          </w:tcPr>
-          <w:p>
-            <w:pPr>
-              <w:spacing w:line="276" w:lineRule="auto"/>
-            </w:pPr>
-            <w:r>
-              <w:rPr>
-                <w:sz w:val="24"/>
-                <w:szCs w:val="24"/>
-              </w:rPr>
-              <w:t>Done</w:t>
-            </w:r>
-          </w:p>
-        </w:tc>
-        <w:tc>
-          <w:tcPr>
-            <w:tcW w:w="1600" w:type="dxa"/>
-            <w:tcBorders>
-              <w:top w:val="single" w:sz="4" w:space="0" w:color="000000"/>
-              <w:left w:val="single" w:sz="4" w:space="0" w:color="000000"/>
-              <w:bottom w:val="single" w:sz="4" w:space="0" w:color="000000"/>
-              <w:right w:val="single" w:sz="4" w:space="0" w:color="000000"/>
-            </w:tcBorders>
-            <w:tcMar>
-              <w:top w:w="40" w:type="dxa"/>
-              <w:left w:w="80" w:type="dxa"/>
-              <w:bottom w:w="40" w:type="dxa"/>
-              <w:right w:w="80" w:type="dxa"/>
-            </w:tcMar>
-          </w:tcPr>
-          <w:p>
-            <w:pPr>
-              <w:spacing w:line="276" w:lineRule="auto"/>
-            </w:pPr>
-            <w:r>
-              <w:rPr>
-                <w:highlight w:val="yellow"/>
-              </w:rPr>
-              <w:t>[учасник 2]</w:t>
-            </w:r>
-          </w:p>
-        </w:tc>
-        <w:tc>
-          <w:tcPr>
-            <w:tcW w:w="1200" w:type="dxa"/>
-            <w:tcBorders>
-              <w:top w:val="single" w:sz="4" w:space="0" w:color="000000"/>
-              <w:left w:val="single" w:sz="4" w:space="0" w:color="000000"/>
-              <w:bottom w:val="single" w:sz="4" w:space="0" w:color="000000"/>
-              <w:right w:val="single" w:sz="4" w:space="0" w:color="000000"/>
-            </w:tcBorders>
-            <w:tcMar>
-              <w:top w:w="40" w:type="dxa"/>
-              <w:left w:w="80" w:type="dxa"/>
-              <w:bottom w:w="40" w:type="dxa"/>
-              <w:right w:w="80" w:type="dxa"/>
-            </w:tcMar>
-          </w:tcPr>
-          <w:p>
-            <w:pPr>
-              <w:spacing w:line="276" w:lineRule="auto"/>
-            </w:pPr>
-            <w:r>
-              <w:rPr>
-                <w:highlight w:val="yellow"/>
-              </w:rPr>
-              <w:t>[дата]</w:t>
-            </w:r>
-          </w:p>
-        </w:tc>
-        <w:tc>
-          <w:tcPr>
-            <w:tcW w:w="2254" w:type="dxa"/>
-            <w:tcBorders>
-              <w:top w:val="single" w:sz="4" w:space="0" w:color="000000"/>
-              <w:left w:val="single" w:sz="4" w:space="0" w:color="000000"/>
-              <w:bottom w:val="single" w:sz="4" w:space="0" w:color="000000"/>
-              <w:right w:val="single" w:sz="4" w:space="0" w:color="000000"/>
-            </w:tcBorders>
-            <w:tcMar>
-              <w:top w:w="40" w:type="dxa"/>
-              <w:left w:w="80" w:type="dxa"/>
-              <w:bottom w:w="40" w:type="dxa"/>
-              <w:right w:w="80" w:type="dxa"/>
-            </w:tcMar>
-          </w:tcPr>
-          <w:p>
-            <w:pPr>
-              <w:spacing w:line="276" w:lineRule="auto"/>
-            </w:pPr>
-            <w:r>
-              <w:rPr>
-                <w:sz w:val="24"/>
-                <w:szCs w:val="24"/>
-              </w:rPr>
-              <w:t>мітка «Ідеї»</w:t>
-            </w:r>
-          </w:p>
-        </w:tc>
-      </w:tr>
-      <w:tr>
-        <w:tblPrEx>
-          <w:tblCellMar>
-            <w:top w:w="0" w:type="dxa"/>
-            <w:bottom w:w="0" w:type="dxa"/>
-          </w:tblCellMar>
-        </w:tblPrEx>
-        <w:trPr>
-          <w:cantSplit/>
-        </w:trPr>
-        <w:tc>
-          <w:tcPr>
-            <w:tcW w:w="3000" w:type="dxa"/>
-            <w:tcBorders>
-              <w:top w:val="single" w:sz="4" w:space="0" w:color="000000"/>
-              <w:left w:val="single" w:sz="4" w:space="0" w:color="000000"/>
-              <w:bottom w:val="single" w:sz="4" w:space="0" w:color="000000"/>
-              <w:right w:val="single" w:sz="4" w:space="0" w:color="000000"/>
-            </w:tcBorders>
-            <w:tcMar>
-              <w:top w:w="40" w:type="dxa"/>
-              <w:left w:w="80" w:type="dxa"/>
-              <w:bottom w:w="40" w:type="dxa"/>
-              <w:right w:w="80" w:type="dxa"/>
-            </w:tcMar>
-          </w:tcPr>
-          <w:p>
-            <w:pPr>
-              <w:spacing w:line="276" w:lineRule="auto"/>
-            </w:pPr>
-            <w:r>
-              <w:rPr>
-                <w:sz w:val="24"/>
-                <w:szCs w:val="24"/>
-              </w:rPr>
-              <w:t>Відібрати ідею за критеріями (користь, складність, час)</w:t>
-            </w:r>
-          </w:p>
-        </w:tc>
-        <w:tc>
-          <w:tcPr>
-            <w:tcW w:w="1300" w:type="dxa"/>
-            <w:tcBorders>
-              <w:top w:val="single" w:sz="4" w:space="0" w:color="000000"/>
-              <w:left w:val="single" w:sz="4" w:space="0" w:color="000000"/>
-              <w:bottom w:val="single" w:sz="4" w:space="0" w:color="000000"/>
-              <w:right w:val="single" w:sz="4" w:space="0" w:color="000000"/>
-            </w:tcBorders>
-            <w:tcMar>
-              <w:top w:w="40" w:type="dxa"/>
-              <w:left w:w="80" w:type="dxa"/>
-              <w:bottom w:w="40" w:type="dxa"/>
-              <w:right w:w="80" w:type="dxa"/>
-            </w:tcMar>
-          </w:tcPr>
-          <w:p>
-            <w:pPr>
-              <w:spacing w:line="276" w:lineRule="auto"/>
-            </w:pPr>
-            <w:r>
-              <w:rPr>
-                <w:sz w:val="24"/>
-                <w:szCs w:val="24"/>
-              </w:rPr>
-              <w:t>In Progress</w:t>
-            </w:r>
-          </w:p>
-        </w:tc>
-        <w:tc>
-          <w:tcPr>
-            <w:tcW w:w="1600" w:type="dxa"/>
-            <w:tcBorders>
-              <w:top w:val="single" w:sz="4" w:space="0" w:color="000000"/>
-              <w:left w:val="single" w:sz="4" w:space="0" w:color="000000"/>
-              <w:bottom w:val="single" w:sz="4" w:space="0" w:color="000000"/>
-              <w:right w:val="single" w:sz="4" w:space="0" w:color="000000"/>
-            </w:tcBorders>
-            <w:tcMar>
-              <w:top w:w="40" w:type="dxa"/>
-              <w:left w:w="80" w:type="dxa"/>
-              <w:bottom w:w="40" w:type="dxa"/>
-              <w:right w:w="80" w:type="dxa"/>
-            </w:tcMar>
-          </w:tcPr>
-          <w:p>
-            <w:pPr>
-              <w:spacing w:line="276" w:lineRule="auto"/>
-            </w:pPr>
-            <w:r>
-              <w:rPr>
-                <w:highlight w:val="yellow"/>
-              </w:rPr>
-              <w:t>[учасник 3]</w:t>
-            </w:r>
-          </w:p>
-        </w:tc>
-        <w:tc>
-          <w:tcPr>
-            <w:tcW w:w="1200" w:type="dxa"/>
-            <w:tcBorders>
-              <w:top w:val="single" w:sz="4" w:space="0" w:color="000000"/>
-              <w:left w:val="single" w:sz="4" w:space="0" w:color="000000"/>
-              <w:bottom w:val="single" w:sz="4" w:space="0" w:color="000000"/>
-              <w:right w:val="single" w:sz="4" w:space="0" w:color="000000"/>
-            </w:tcBorders>
-            <w:tcMar>
-              <w:top w:w="40" w:type="dxa"/>
-              <w:left w:w="80" w:type="dxa"/>
-              <w:bottom w:w="40" w:type="dxa"/>
-              <w:right w:w="80" w:type="dxa"/>
-            </w:tcMar>
-          </w:tcPr>
-          <w:p>
-            <w:pPr>
-              <w:spacing w:line="276" w:lineRule="auto"/>
-            </w:pPr>
-            <w:r>
-              <w:rPr>
-                <w:highlight w:val="yellow"/>
-              </w:rPr>
-              <w:t>[дата]</w:t>
-            </w:r>
-          </w:p>
-        </w:tc>
-        <w:tc>
-          <w:tcPr>
-            <w:tcW w:w="2254" w:type="dxa"/>
-            <w:tcBorders>
-              <w:top w:val="single" w:sz="4" w:space="0" w:color="000000"/>
-              <w:left w:val="single" w:sz="4" w:space="0" w:color="000000"/>
-              <w:bottom w:val="single" w:sz="4" w:space="0" w:color="000000"/>
-              <w:right w:val="single" w:sz="4" w:space="0" w:color="000000"/>
-            </w:tcBorders>
-            <w:tcMar>
-              <w:top w:w="40" w:type="dxa"/>
-              <w:left w:w="80" w:type="dxa"/>
-              <w:bottom w:w="40" w:type="dxa"/>
-              <w:right w:w="80" w:type="dxa"/>
-            </w:tcMar>
-          </w:tcPr>
-          <w:p>
-            <w:pPr>
-              <w:spacing w:line="276" w:lineRule="auto"/>
-            </w:pPr>
-            <w:r>
-              <w:rPr>
-                <w:sz w:val="24"/>
-                <w:szCs w:val="24"/>
-              </w:rPr>
-              <w:t>чекліст «Критерії відбору»</w:t>
-            </w:r>
-          </w:p>
-        </w:tc>
-      </w:tr>
-      <w:tr>
-        <w:tblPrEx>
-          <w:tblCellMar>
-            <w:top w:w="0" w:type="dxa"/>
-            <w:bottom w:w="0" w:type="dxa"/>
-          </w:tblCellMar>
-        </w:tblPrEx>
-        <w:trPr>
-          <w:cantSplit/>
-        </w:trPr>
-        <w:tc>
-          <w:tcPr>
-            <w:tcW w:w="3000" w:type="dxa"/>
-            <w:tcBorders>
-              <w:top w:val="single" w:sz="4" w:space="0" w:color="000000"/>
-              <w:left w:val="single" w:sz="4" w:space="0" w:color="000000"/>
-              <w:bottom w:val="single" w:sz="4" w:space="0" w:color="000000"/>
-              <w:right w:val="single" w:sz="4" w:space="0" w:color="000000"/>
-            </w:tcBorders>
-            <w:tcMar>
-              <w:top w:w="40" w:type="dxa"/>
-              <w:left w:w="80" w:type="dxa"/>
-              <w:bottom w:w="40" w:type="dxa"/>
-              <w:right w:w="80" w:type="dxa"/>
-            </w:tcMar>
-          </w:tcPr>
-          <w:p>
-            <w:pPr>
-              <w:spacing w:line="276" w:lineRule="auto"/>
-            </w:pPr>
-            <w:r>
-              <w:rPr>
-                <w:sz w:val="24"/>
-                <w:szCs w:val="24"/>
-              </w:rPr>
-              <w:t>Описати функції та екрани обраного застосунку</w:t>
-            </w:r>
-          </w:p>
-        </w:tc>
-        <w:tc>
-          <w:tcPr>
-            <w:tcW w:w="1300" w:type="dxa"/>
-            <w:tcBorders>
-              <w:top w:val="single" w:sz="4" w:space="0" w:color="000000"/>
-              <w:left w:val="single" w:sz="4" w:space="0" w:color="000000"/>
-              <w:bottom w:val="single" w:sz="4" w:space="0" w:color="000000"/>
-              <w:right w:val="single" w:sz="4" w:space="0" w:color="000000"/>
-            </w:tcBorders>
-            <w:tcMar>
-              <w:top w:w="40" w:type="dxa"/>
-              <w:left w:w="80" w:type="dxa"/>
-              <w:bottom w:w="40" w:type="dxa"/>
-              <w:right w:w="80" w:type="dxa"/>
-            </w:tcMar>
-          </w:tcPr>
-          <w:p>
-            <w:pPr>
-              <w:spacing w:line="276" w:lineRule="auto"/>
-            </w:pPr>
-            <w:r>
-              <w:rPr>
-                <w:sz w:val="24"/>
-                <w:szCs w:val="24"/>
-              </w:rPr>
-              <w:t>To Do</w:t>
-            </w:r>
-          </w:p>
-        </w:tc>
-        <w:tc>
-          <w:tcPr>
-            <w:tcW w:w="1600" w:type="dxa"/>
-            <w:tcBorders>
-              <w:top w:val="single" w:sz="4" w:space="0" w:color="000000"/>
-              <w:left w:val="single" w:sz="4" w:space="0" w:color="000000"/>
-              <w:bottom w:val="single" w:sz="4" w:space="0" w:color="000000"/>
-              <w:right w:val="single" w:sz="4" w:space="0" w:color="000000"/>
-            </w:tcBorders>
-            <w:tcMar>
-              <w:top w:w="40" w:type="dxa"/>
-              <w:left w:w="80" w:type="dxa"/>
-              <w:bottom w:w="40" w:type="dxa"/>
-              <w:right w:w="80" w:type="dxa"/>
-            </w:tcMar>
-          </w:tcPr>
-          <w:p>
-            <w:pPr>
-              <w:spacing w:line="276" w:lineRule="auto"/>
-            </w:pPr>
-            <w:r>
-              <w:rPr>
-                <w:sz w:val="24"/>
-                <w:szCs w:val="24"/>
-              </w:rPr>
-              <w:t>Бойчук А. А.</w:t>
-            </w:r>
-          </w:p>
-        </w:tc>
-        <w:tc>
-          <w:tcPr>
-            <w:tcW w:w="1200" w:type="dxa"/>
-            <w:tcBorders>
-              <w:top w:val="single" w:sz="4" w:space="0" w:color="000000"/>
-              <w:left w:val="single" w:sz="4" w:space="0" w:color="000000"/>
-              <w:bottom w:val="single" w:sz="4" w:space="0" w:color="000000"/>
-              <w:right w:val="single" w:sz="4" w:space="0" w:color="000000"/>
-            </w:tcBorders>
-            <w:tcMar>
-              <w:top w:w="40" w:type="dxa"/>
-              <w:left w:w="80" w:type="dxa"/>
-              <w:bottom w:w="40" w:type="dxa"/>
-              <w:right w:w="80" w:type="dxa"/>
-            </w:tcMar>
-          </w:tcPr>
-          <w:p>
-            <w:pPr>
-              <w:spacing w:line="276" w:lineRule="auto"/>
-            </w:pPr>
-            <w:r>
-              <w:rPr>
-                <w:highlight w:val="yellow"/>
-              </w:rPr>
-              <w:t>[дата]</w:t>
-            </w:r>
-          </w:p>
-        </w:tc>
-        <w:tc>
-          <w:tcPr>
-            <w:tcW w:w="2254" w:type="dxa"/>
-            <w:tcBorders>
-              <w:top w:val="single" w:sz="4" w:space="0" w:color="000000"/>
-              <w:left w:val="single" w:sz="4" w:space="0" w:color="000000"/>
-              <w:bottom w:val="single" w:sz="4" w:space="0" w:color="000000"/>
-              <w:right w:val="single" w:sz="4" w:space="0" w:color="000000"/>
-            </w:tcBorders>
-            <w:tcMar>
-              <w:top w:w="40" w:type="dxa"/>
-              <w:left w:w="80" w:type="dxa"/>
-              <w:bottom w:w="40" w:type="dxa"/>
-              <w:right w:w="80" w:type="dxa"/>
-            </w:tcMar>
-          </w:tcPr>
-          <w:p>
-            <w:pPr>
-              <w:spacing w:line="276" w:lineRule="auto"/>
-            </w:pPr>
-            <w:r>
-              <w:rPr>
-                <w:sz w:val="24"/>
-                <w:szCs w:val="24"/>
-              </w:rPr>
-              <w:t>мітка «Застосунок»</w:t>
-            </w:r>
-          </w:p>
-        </w:tc>
-      </w:tr>
-      <w:tr>
-        <w:tblPrEx>
-          <w:tblCellMar>
-            <w:top w:w="0" w:type="dxa"/>
-            <w:bottom w:w="0" w:type="dxa"/>
-          </w:tblCellMar>
-        </w:tblPrEx>
-        <w:trPr>
-          <w:cantSplit/>
-        </w:trPr>
-        <w:tc>
-          <w:tcPr>
-            <w:tcW w:w="3000" w:type="dxa"/>
-            <w:tcBorders>
-              <w:top w:val="single" w:sz="4" w:space="0" w:color="000000"/>
-              <w:left w:val="single" w:sz="4" w:space="0" w:color="000000"/>
-              <w:bottom w:val="single" w:sz="4" w:space="0" w:color="000000"/>
-              <w:right w:val="single" w:sz="4" w:space="0" w:color="000000"/>
-            </w:tcBorders>
-            <w:tcMar>
-              <w:top w:w="40" w:type="dxa"/>
-              <w:left w:w="80" w:type="dxa"/>
-              <w:bottom w:w="40" w:type="dxa"/>
-              <w:right w:w="80" w:type="dxa"/>
-            </w:tcMar>
-          </w:tcPr>
-          <w:p>
-            <w:pPr>
-              <w:spacing w:line="276" w:lineRule="auto"/>
-            </w:pPr>
-            <w:r>
-              <w:rPr>
-                <w:sz w:val="24"/>
-                <w:szCs w:val="24"/>
-              </w:rPr>
-              <w:t>Підготувати презентацію ідеї застосунку</w:t>
-            </w:r>
-          </w:p>
-        </w:tc>
-        <w:tc>
-          <w:tcPr>
-            <w:tcW w:w="1300" w:type="dxa"/>
-            <w:tcBorders>
-              <w:top w:val="single" w:sz="4" w:space="0" w:color="000000"/>
-              <w:left w:val="single" w:sz="4" w:space="0" w:color="000000"/>
-              <w:bottom w:val="single" w:sz="4" w:space="0" w:color="000000"/>
-              <w:right w:val="single" w:sz="4" w:space="0" w:color="000000"/>
-            </w:tcBorders>
-            <w:tcMar>
-              <w:top w:w="40" w:type="dxa"/>
-              <w:left w:w="80" w:type="dxa"/>
-              <w:bottom w:w="40" w:type="dxa"/>
-              <w:right w:w="80" w:type="dxa"/>
-            </w:tcMar>
-          </w:tcPr>
-          <w:p>
-            <w:pPr>
-              <w:spacing w:line="276" w:lineRule="auto"/>
-            </w:pPr>
-            <w:r>
-              <w:rPr>
-                <w:sz w:val="24"/>
-                <w:szCs w:val="24"/>
-              </w:rPr>
-              <w:t>To Do</w:t>
-            </w:r>
-          </w:p>
-        </w:tc>
-        <w:tc>
-          <w:tcPr>
-            <w:tcW w:w="1600" w:type="dxa"/>
-            <w:tcBorders>
-              <w:top w:val="single" w:sz="4" w:space="0" w:color="000000"/>
-              <w:left w:val="single" w:sz="4" w:space="0" w:color="000000"/>
-              <w:bottom w:val="single" w:sz="4" w:space="0" w:color="000000"/>
-              <w:right w:val="single" w:sz="4" w:space="0" w:color="000000"/>
-            </w:tcBorders>
-            <w:tcMar>
-              <w:top w:w="40" w:type="dxa"/>
-              <w:left w:w="80" w:type="dxa"/>
-              <w:bottom w:w="40" w:type="dxa"/>
-              <w:right w:w="80" w:type="dxa"/>
-            </w:tcMar>
-          </w:tcPr>
-          <w:p>
-            <w:pPr>
-              <w:spacing w:line="276" w:lineRule="auto"/>
-            </w:pPr>
-            <w:r>
-              <w:rPr>
-                <w:highlight w:val="yellow"/>
-              </w:rPr>
-              <w:t>[учасник 4]</w:t>
-            </w:r>
-          </w:p>
-        </w:tc>
-        <w:tc>
-          <w:tcPr>
-            <w:tcW w:w="1200" w:type="dxa"/>
-            <w:tcBorders>
-              <w:top w:val="single" w:sz="4" w:space="0" w:color="000000"/>
-              <w:left w:val="single" w:sz="4" w:space="0" w:color="000000"/>
-              <w:bottom w:val="single" w:sz="4" w:space="0" w:color="000000"/>
-              <w:right w:val="single" w:sz="4" w:space="0" w:color="000000"/>
-            </w:tcBorders>
-            <w:tcMar>
-              <w:top w:w="40" w:type="dxa"/>
-              <w:left w:w="80" w:type="dxa"/>
-              <w:bottom w:w="40" w:type="dxa"/>
-              <w:right w:w="80" w:type="dxa"/>
-            </w:tcMar>
-          </w:tcPr>
-          <w:p>
-            <w:pPr>
-              <w:spacing w:line="276" w:lineRule="auto"/>
-            </w:pPr>
-            <w:r>
-              <w:rPr>
-                <w:highlight w:val="yellow"/>
-              </w:rPr>
-              <w:t>[дата]</w:t>
-            </w:r>
-          </w:p>
-        </w:tc>
-        <w:tc>
-          <w:tcPr>
-            <w:tcW w:w="2254" w:type="dxa"/>
-            <w:tcBorders>
-              <w:top w:val="single" w:sz="4" w:space="0" w:color="000000"/>
-              <w:left w:val="single" w:sz="4" w:space="0" w:color="000000"/>
-              <w:bottom w:val="single" w:sz="4" w:space="0" w:color="000000"/>
-              <w:right w:val="single" w:sz="4" w:space="0" w:color="000000"/>
-            </w:tcBorders>
-            <w:tcMar>
-              <w:top w:w="40" w:type="dxa"/>
-              <w:left w:w="80" w:type="dxa"/>
-              <w:bottom w:w="40" w:type="dxa"/>
-              <w:right w:w="80" w:type="dxa"/>
-            </w:tcMar>
-          </w:tcPr>
-          <w:p>
-            <w:pPr>
-              <w:spacing w:line="276" w:lineRule="auto"/>
-            </w:pPr>
-            <w:r>
-              <w:rPr>
-                <w:sz w:val="24"/>
-                <w:szCs w:val="24"/>
-              </w:rPr>
-              <w:t>чекліст «Слайди»</w:t>
+              <w:t xml:space="preserve">—</w:t>
             </w:r>
           </w:p>
         </w:tc>
       </w:tr>
     </w:tbl>
-    <w:p>
-      <w:pPr>
-        <w:spacing w:line="360" w:lineRule="auto"/>
-      </w:pPr>
-    </w:p>
-    <w:tbl>
-      <w:tblPr>
-        <w:tblW w:w="9354" w:type="dxa"/>
-        <w:tblBorders>
-          <w:top w:val="single" w:sz="4" w:space="0" w:color="auto"/>
-          <w:left w:val="single" w:sz="4" w:space="0" w:color="auto"/>
-          <w:bottom w:val="single" w:sz="4" w:space="0" w:color="auto"/>
-          <w:right w:val="single" w:sz="4" w:space="0" w:color="auto"/>
-          <w:insideH w:val="single" w:sz="4" w:space="0" w:color="auto"/>
-          <w:insideV w:val="single" w:sz="4" w:space="0" w:color="auto"/>
-        </w:tblBorders>
-        <w:tblCellMar>
-          <w:left w:w="10" w:type="dxa"/>
-          <w:right w:w="10" w:type="dxa"/>
-        </w:tblCellMar>
-        <w:tblLook w:val="04A0" w:firstRow="1" w:lastRow="0" w:firstColumn="1" w:lastColumn="0" w:noHBand="0" w:noVBand="1"/>
-      </w:tblPr>
-      <w:tblGrid>
-        <w:gridCol w:w="9354"/>
-      </w:tblGrid>
-      <w:tr>
-        <w:tblPrEx>
-          <w:tblCellMar>
-            <w:top w:w="0" w:type="dxa"/>
-            <w:bottom w:w="0" w:type="dxa"/>
-          </w:tblCellMar>
-        </w:tblPrEx>
-        <w:tc>
-          <w:tcPr>
-            <w:tcW w:w="9354" w:type="dxa"/>
-            <w:tcBorders>
-              <w:top w:val="dashed" w:sz="8" w:space="0" w:color="C00000"/>
-              <w:left w:val="dashed" w:sz="8" w:space="0" w:color="C00000"/>
-              <w:bottom w:val="dashed" w:sz="8" w:space="0" w:color="C00000"/>
-              <w:right w:val="dashed" w:sz="8" w:space="0" w:color="C00000"/>
-            </w:tcBorders>
-            <w:tcMar>
-              <w:top w:w="700" w:type="dxa"/>
-              <w:left w:w="200" w:type="dxa"/>
-              <w:bottom w:w="700" w:type="dxa"/>
-              <w:right w:w="200" w:type="dxa"/>
-            </w:tcMar>
-          </w:tcPr>
-          <w:p>
-            <w:pPr>
-              <w:spacing w:line="360" w:lineRule="auto"/>
-              <w:jc w:val="center"/>
-            </w:pPr>
-            <w:r>
-              <w:rPr>
-                <w:b/>
-                <w:bCs/>
-                <w:color w:val="C00000"/>
-              </w:rPr>
-              <w:t>ВСТАВИТИ СКРИНШОТ</w:t>
-            </w:r>
-          </w:p>
-          <w:p>
-            <w:pPr>
-              <w:spacing w:line="360" w:lineRule="auto"/>
-              <w:jc w:val="center"/>
-            </w:pPr>
-            <w:r>
-              <w:rPr>
-                <w:color w:val="C00000"/>
-                <w:sz w:val="24"/>
-                <w:szCs w:val="24"/>
-              </w:rPr>
-              <w:t>Скриншот відкритої картки: учасники, термін виконання, чекліст «Командні кроки»</w:t>
-            </w:r>
-          </w:p>
-        </w:tc>
-      </w:tr>
-    </w:tbl>
-    <w:p>
-      <w:pPr>
-        <w:spacing w:before="120" w:after="240" w:line="360" w:lineRule="auto"/>
-        <w:jc w:val="center"/>
-      </w:pPr>
-      <w:r>
-        <w:t>Рисунок 2 — Картка з призначеними виконавцями, дедлайном і чеклістом</w:t>
-      </w:r>
-    </w:p>
     <w:p>
       <w:pPr>
         <w:keepNext/>
@@ -4979,94 +4372,71 @@
         <w:jc w:val="both"/>
       </w:pPr>
       <w:r>
-        <w:t xml:space="preserve">У коментарях до карток кожен учасник залишив щонайменше одне повідомлення, яке імітує реальну робочу ситуацію: координатор уточнив </w:t>
-      </w:r>
-      <w:r>
-        <w:lastRenderedPageBreak/>
-        <w:t>критерії відбору ідей, генератор ідей запропонував три варіанти застосунку, аналітик зауважив щодо трудомісткості одного з варіантів, завершувач нагадав про дедлайн (рис. 3). Дедлайни встановлено через поле «Термін», а чеклісти — через кнопку «Чекліст» у картці; прогрес чекліста відображається на обкладинці картки у відсотках.</w:t>
-      </w:r>
-    </w:p>
-    <w:tbl>
-      <w:tblPr>
-        <w:tblW w:w="9354" w:type="dxa"/>
-        <w:tblBorders>
-          <w:top w:val="single" w:sz="4" w:space="0" w:color="auto"/>
-          <w:left w:val="single" w:sz="4" w:space="0" w:color="auto"/>
-          <w:bottom w:val="single" w:sz="4" w:space="0" w:color="auto"/>
-          <w:right w:val="single" w:sz="4" w:space="0" w:color="auto"/>
-          <w:insideH w:val="single" w:sz="4" w:space="0" w:color="auto"/>
-          <w:insideV w:val="single" w:sz="4" w:space="0" w:color="auto"/>
-        </w:tblBorders>
-        <w:tblCellMar>
-          <w:left w:w="10" w:type="dxa"/>
-          <w:right w:w="10" w:type="dxa"/>
-        </w:tblCellMar>
-        <w:tblLook w:val="04A0" w:firstRow="1" w:lastRow="0" w:firstColumn="1" w:lastColumn="0" w:noHBand="0" w:noVBand="1"/>
-      </w:tblPr>
-      <w:tblGrid>
-        <w:gridCol w:w="9354"/>
-      </w:tblGrid>
-      <w:tr>
-        <w:tblPrEx>
-          <w:tblCellMar>
-            <w:top w:w="0" w:type="dxa"/>
-            <w:bottom w:w="0" w:type="dxa"/>
-          </w:tblCellMar>
-        </w:tblPrEx>
-        <w:tc>
-          <w:tcPr>
-            <w:tcW w:w="9354" w:type="dxa"/>
-            <w:tcBorders>
-              <w:top w:val="dashed" w:sz="8" w:space="0" w:color="C00000"/>
-              <w:left w:val="dashed" w:sz="8" w:space="0" w:color="C00000"/>
-              <w:bottom w:val="dashed" w:sz="8" w:space="0" w:color="C00000"/>
-              <w:right w:val="dashed" w:sz="8" w:space="0" w:color="C00000"/>
-            </w:tcBorders>
-            <w:tcMar>
-              <w:top w:w="700" w:type="dxa"/>
-              <w:left w:w="200" w:type="dxa"/>
-              <w:bottom w:w="700" w:type="dxa"/>
-              <w:right w:w="200" w:type="dxa"/>
-            </w:tcMar>
-          </w:tcPr>
-          <w:p>
-            <w:pPr>
-              <w:spacing w:line="360" w:lineRule="auto"/>
-              <w:jc w:val="center"/>
-            </w:pPr>
-            <w:r>
-              <w:rPr>
-                <w:b/>
-                <w:bCs/>
-                <w:color w:val="C00000"/>
-              </w:rPr>
-              <w:t>ВСТАВИТИ СКРИНШОТ</w:t>
-            </w:r>
-          </w:p>
-          <w:p>
-            <w:pPr>
-              <w:spacing w:line="360" w:lineRule="auto"/>
-              <w:jc w:val="center"/>
-            </w:pPr>
-            <w:r>
-              <w:rPr>
-                <w:color w:val="C00000"/>
-                <w:sz w:val="24"/>
-                <w:szCs w:val="24"/>
-              </w:rPr>
-              <w:t>Скриншот стрічки коментарів картки з повідомленнями від кожного учасника</w:t>
-            </w:r>
-          </w:p>
-        </w:tc>
-      </w:tr>
-    </w:tbl>
+        <w:t xml:space="preserve">Обговорення в коментарях до карток велося мінімально: на дошці є один коментар — Вітер Нікіта 19.10.2026 у картці «Розподіл ролей…» доручив Блохіну В. О. зібрати референси щодо дизайну (рис. 3). Під коментарем у стрічці картки автоматично фіксуються службові записи: додавання учасників до картки та зміна дати завершення.</w:t>
+      </w:r>
+    </w:p>
+    <w:p>
+      <w:pPr>
+        <w:spacing w:line="360" w:lineRule="auto"/>
+        <w:ind w:firstLine="709"/>
+        <w:jc w:val="both"/>
+      </w:pPr>
+      <w:r>
+        <w:t xml:space="preserve">Дедлайни встановлено через поле «Дата завершення» картки. Оскільки їх задали вже після фактичних дат виконання етапів, Trello позначає картки як прострочені.</w:t>
+      </w:r>
+    </w:p>
+    <w:p>
+      <w:pPr>
+        <w:keepNext/>
+        <w:spacing w:before="120" w:line="240" w:lineRule="auto"/>
+        <w:jc w:val="center"/>
+      </w:pPr>
+      <w:r>
+        <w:drawing>
+          <wp:inline distT="0" distB="0" distL="0" distR="0">
+            <wp:extent cx="2340000" cy="3470339"/>
+            <wp:docPr id="103" name="trello_fig3.png"/>
+            <a:graphic xmlns:a="http://schemas.openxmlformats.org/drawingml/2006/main">
+              <a:graphicData uri="http://schemas.openxmlformats.org/drawingml/2006/picture">
+                <pic:pic xmlns:pic="http://schemas.openxmlformats.org/drawingml/2006/picture">
+                  <pic:nvPicPr>
+                    <pic:cNvPr id="103" name="trello_fig3.png"/>
+                    <pic:cNvPicPr/>
+                  </pic:nvPicPr>
+                  <pic:blipFill>
+                    <a:blip r:embed="rIdTrellofig3"/>
+                    <a:stretch>
+                      <a:fillRect/>
+                    </a:stretch>
+                  </pic:blipFill>
+                  <pic:spPr>
+                    <a:xfrm>
+                      <a:off x="0" y="0"/>
+                      <a:ext cx="2340000" cy="3470339"/>
+                    </a:xfrm>
+                    <a:prstGeom prst="rect">
+                      <a:avLst/>
+                    </a:prstGeom>
+                    <a:ln w="6350">
+                      <a:solidFill>
+                        <a:srgbClr val="808080"/>
+                      </a:solidFill>
+                    </a:ln>
+                  </pic:spPr>
+                </pic:pic>
+              </a:graphicData>
+            </a:graphic>
+          </wp:inline>
+        </w:drawing>
+      </w:r>
+    </w:p>
     <w:p>
       <w:pPr>
         <w:spacing w:before="120" w:after="240" w:line="360" w:lineRule="auto"/>
         <w:jc w:val="center"/>
       </w:pPr>
       <w:r>
-        <w:t>Рисунок 3 — Коментарі учасників команди в картці</w:t>
+        <w:t>Рисунок 3 — Коментар і стрічка активності картки</w:t>
       </w:r>
     </w:p>
     <w:p>
@@ -5090,90 +4460,61 @@
         <w:jc w:val="both"/>
       </w:pPr>
       <w:r>
-        <w:t>Для імітації робочого процесу картку «Пройти тест Белбіна й занести роль у картку» перетягнуто зі списку «To Do» у «In Progress», а після заповнення чекліста всіма учасниками — у «Done». Історію переміщення зафіксовано у стрічці активності картки (рис. 4).</w:t>
-      </w:r>
-    </w:p>
-    <w:tbl>
-      <w:tblPr>
-        <w:tblW w:w="9354" w:type="dxa"/>
-        <w:tblBorders>
-          <w:top w:val="single" w:sz="4" w:space="0" w:color="auto"/>
-          <w:left w:val="single" w:sz="4" w:space="0" w:color="auto"/>
-          <w:bottom w:val="single" w:sz="4" w:space="0" w:color="auto"/>
-          <w:right w:val="single" w:sz="4" w:space="0" w:color="auto"/>
-          <w:insideH w:val="single" w:sz="4" w:space="0" w:color="auto"/>
-          <w:insideV w:val="single" w:sz="4" w:space="0" w:color="auto"/>
-        </w:tblBorders>
-        <w:tblCellMar>
-          <w:left w:w="10" w:type="dxa"/>
-          <w:right w:w="10" w:type="dxa"/>
-        </w:tblCellMar>
-        <w:tblLook w:val="04A0" w:firstRow="1" w:lastRow="0" w:firstColumn="1" w:lastColumn="0" w:noHBand="0" w:noVBand="1"/>
-      </w:tblPr>
-      <w:tblGrid>
-        <w:gridCol w:w="9354"/>
-      </w:tblGrid>
-      <w:tr>
-        <w:tblPrEx>
-          <w:tblCellMar>
-            <w:top w:w="0" w:type="dxa"/>
-            <w:bottom w:w="0" w:type="dxa"/>
-          </w:tblCellMar>
-        </w:tblPrEx>
-        <w:tc>
-          <w:tcPr>
-            <w:tcW w:w="9354" w:type="dxa"/>
-            <w:tcBorders>
-              <w:top w:val="dashed" w:sz="8" w:space="0" w:color="C00000"/>
-              <w:left w:val="dashed" w:sz="8" w:space="0" w:color="C00000"/>
-              <w:bottom w:val="dashed" w:sz="8" w:space="0" w:color="C00000"/>
-              <w:right w:val="dashed" w:sz="8" w:space="0" w:color="C00000"/>
-            </w:tcBorders>
-            <w:tcMar>
-              <w:top w:w="700" w:type="dxa"/>
-              <w:left w:w="200" w:type="dxa"/>
-              <w:bottom w:w="700" w:type="dxa"/>
-              <w:right w:w="200" w:type="dxa"/>
-            </w:tcMar>
-          </w:tcPr>
-          <w:p>
-            <w:pPr>
-              <w:spacing w:line="360" w:lineRule="auto"/>
-              <w:jc w:val="center"/>
-            </w:pPr>
-            <w:r>
-              <w:rPr>
-                <w:b/>
-                <w:bCs/>
-                <w:color w:val="C00000"/>
-              </w:rPr>
-              <w:t>ВСТАВИТИ СКРИНШОТ</w:t>
-            </w:r>
-          </w:p>
-          <w:p>
-            <w:pPr>
-              <w:spacing w:line="360" w:lineRule="auto"/>
-              <w:jc w:val="center"/>
-            </w:pPr>
-            <w:r>
-              <w:rPr>
-                <w:color w:val="C00000"/>
-                <w:sz w:val="24"/>
-                <w:szCs w:val="24"/>
-              </w:rPr>
-              <w:t>Скриншот дошки після переміщення картки та (за бажанням) стрічки активності картки</w:t>
-            </w:r>
-          </w:p>
-        </w:tc>
-      </w:tr>
-    </w:tbl>
+        <w:t xml:space="preserve">Картки між списками не перетягувалися: кожну з трьох карток створено одразу в списку, що відповідає її стану. Це видно у стрічці активності дошки (Меню → Активність), яка фіксує, хто й коли створив картку, додав учасника, змінив дедлайн або залишив коментар (рис. 4).</w:t>
+      </w:r>
+    </w:p>
+    <w:p>
+      <w:pPr>
+        <w:keepNext/>
+        <w:spacing w:before="120" w:line="240" w:lineRule="auto"/>
+        <w:jc w:val="center"/>
+      </w:pPr>
+      <w:r>
+        <w:drawing>
+          <wp:inline distT="0" distB="0" distL="0" distR="0">
+            <wp:extent cx="5400000" cy="2818681"/>
+            <wp:docPr id="104" name="trello_fig4.png"/>
+            <a:graphic xmlns:a="http://schemas.openxmlformats.org/drawingml/2006/main">
+              <a:graphicData uri="http://schemas.openxmlformats.org/drawingml/2006/picture">
+                <pic:pic xmlns:pic="http://schemas.openxmlformats.org/drawingml/2006/picture">
+                  <pic:nvPicPr>
+                    <pic:cNvPr id="104" name="trello_fig4.png"/>
+                    <pic:cNvPicPr/>
+                  </pic:nvPicPr>
+                  <pic:blipFill>
+                    <a:blip r:embed="rIdTrellofig4"/>
+                    <a:stretch>
+                      <a:fillRect/>
+                    </a:stretch>
+                  </pic:blipFill>
+                  <pic:spPr>
+                    <a:xfrm>
+                      <a:off x="0" y="0"/>
+                      <a:ext cx="5400000" cy="2818681"/>
+                    </a:xfrm>
+                    <a:prstGeom prst="rect">
+                      <a:avLst/>
+                    </a:prstGeom>
+                    <a:ln w="6350">
+                      <a:solidFill>
+                        <a:srgbClr val="808080"/>
+                      </a:solidFill>
+                    </a:ln>
+                  </pic:spPr>
+                </pic:pic>
+              </a:graphicData>
+            </a:graphic>
+          </wp:inline>
+        </w:drawing>
+      </w:r>
+    </w:p>
     <w:p>
       <w:pPr>
         <w:spacing w:before="120" w:after="240" w:line="360" w:lineRule="auto"/>
         <w:jc w:val="center"/>
       </w:pPr>
       <w:r>
-        <w:t>Рисунок 4 — Переміщення картки «To Do» → «In Progress» → «Done»</w:t>
+        <w:t>Рисунок 4 — Стрічка активності дошки «Командна робота ЛР-3»</w:t>
       </w:r>
     </w:p>
     <w:p>
@@ -5183,84 +4524,54 @@
         <w:jc w:val="both"/>
       </w:pPr>
       <w:r>
-        <w:t>Систему оповіщень налаштовано в профілі (Налаштування → Сповіщення): увімкнено сповіщення про призначення на картку, згадування (@ім’я), коментарі та наближення дедлайну; частоту e-mail-повідомлень встановлено «миттєво» (рис. 5).</w:t>
-      </w:r>
-    </w:p>
-    <w:tbl>
-      <w:tblPr>
-        <w:tblW w:w="9354" w:type="dxa"/>
-        <w:tblBorders>
-          <w:top w:val="single" w:sz="4" w:space="0" w:color="auto"/>
-          <w:left w:val="single" w:sz="4" w:space="0" w:color="auto"/>
-          <w:bottom w:val="single" w:sz="4" w:space="0" w:color="auto"/>
-          <w:right w:val="single" w:sz="4" w:space="0" w:color="auto"/>
-          <w:insideH w:val="single" w:sz="4" w:space="0" w:color="auto"/>
-          <w:insideV w:val="single" w:sz="4" w:space="0" w:color="auto"/>
-        </w:tblBorders>
-        <w:tblCellMar>
-          <w:left w:w="10" w:type="dxa"/>
-          <w:right w:w="10" w:type="dxa"/>
-        </w:tblCellMar>
-        <w:tblLook w:val="04A0" w:firstRow="1" w:lastRow="0" w:firstColumn="1" w:lastColumn="0" w:noHBand="0" w:noVBand="1"/>
-      </w:tblPr>
-      <w:tblGrid>
-        <w:gridCol w:w="9354"/>
-      </w:tblGrid>
-      <w:tr>
-        <w:tblPrEx>
-          <w:tblCellMar>
-            <w:top w:w="0" w:type="dxa"/>
-            <w:bottom w:w="0" w:type="dxa"/>
-          </w:tblCellMar>
-        </w:tblPrEx>
-        <w:tc>
-          <w:tcPr>
-            <w:tcW w:w="9354" w:type="dxa"/>
-            <w:tcBorders>
-              <w:top w:val="dashed" w:sz="8" w:space="0" w:color="C00000"/>
-              <w:left w:val="dashed" w:sz="8" w:space="0" w:color="C00000"/>
-              <w:bottom w:val="dashed" w:sz="8" w:space="0" w:color="C00000"/>
-              <w:right w:val="dashed" w:sz="8" w:space="0" w:color="C00000"/>
-            </w:tcBorders>
-            <w:tcMar>
-              <w:top w:w="700" w:type="dxa"/>
-              <w:left w:w="200" w:type="dxa"/>
-              <w:bottom w:w="700" w:type="dxa"/>
-              <w:right w:w="200" w:type="dxa"/>
-            </w:tcMar>
-          </w:tcPr>
-          <w:p>
-            <w:pPr>
-              <w:spacing w:line="360" w:lineRule="auto"/>
-              <w:jc w:val="center"/>
-            </w:pPr>
-            <w:r>
-              <w:rPr>
-                <w:b/>
-                <w:bCs/>
-                <w:color w:val="C00000"/>
-              </w:rPr>
-              <w:lastRenderedPageBreak/>
-              <w:t>ВСТАВИТИ СКРИНШОТ</w:t>
-            </w:r>
-          </w:p>
-          <w:p>
-            <w:pPr>
-              <w:spacing w:line="360" w:lineRule="auto"/>
-              <w:jc w:val="center"/>
-            </w:pPr>
-            <w:r>
-              <w:rPr>
-                <w:color w:val="C00000"/>
-                <w:sz w:val="24"/>
-                <w:szCs w:val="24"/>
-              </w:rPr>
-              <w:t>Скриншот сторінки налаштувань сповіщень облікового запису</w:t>
-            </w:r>
-          </w:p>
-        </w:tc>
-      </w:tr>
-    </w:tbl>
+        <w:t xml:space="preserve">Сповіщення налаштовано в профілі (Налаштування → Сповіщення електронною поштою): частота — «Періодично» (погодинно), увімкнено всі типи сповіщень, зокрема про нові коментарі, дати завершення, додані вкладення, створення та переміщення карток (рис. 5).</w:t>
+      </w:r>
+    </w:p>
+    <w:p>
+      <w:pPr>
+        <w:keepNext/>
+        <w:spacing w:before="120" w:line="240" w:lineRule="auto"/>
+        <w:jc w:val="center"/>
+      </w:pPr>
+      <w:r>
+        <w:drawing>
+          <wp:inline distT="0" distB="0" distL="0" distR="0">
+            <wp:extent cx="3060000" cy="2460750"/>
+            <wp:docPr id="105" name="trello_fig5.png"/>
+            <a:graphic xmlns:a="http://schemas.openxmlformats.org/drawingml/2006/main">
+              <a:graphicData uri="http://schemas.openxmlformats.org/drawingml/2006/picture">
+                <pic:pic xmlns:pic="http://schemas.openxmlformats.org/drawingml/2006/picture">
+                  <pic:nvPicPr>
+                    <pic:cNvPr id="105" name="trello_fig5.png"/>
+                    <pic:cNvPicPr/>
+                  </pic:nvPicPr>
+                  <pic:blipFill>
+                    <a:blip r:embed="rIdTrellofig5"/>
+                    <a:stretch>
+                      <a:fillRect/>
+                    </a:stretch>
+                  </pic:blipFill>
+                  <pic:spPr>
+                    <a:xfrm>
+                      <a:off x="0" y="0"/>
+                      <a:ext cx="3060000" cy="2460750"/>
+                    </a:xfrm>
+                    <a:prstGeom prst="rect">
+                      <a:avLst/>
+                    </a:prstGeom>
+                    <a:ln w="6350">
+                      <a:solidFill>
+                        <a:srgbClr val="808080"/>
+                      </a:solidFill>
+                    </a:ln>
+                  </pic:spPr>
+                </pic:pic>
+              </a:graphicData>
+            </a:graphic>
+          </wp:inline>
+        </w:drawing>
+      </w:r>
+    </w:p>
     <w:p>
       <w:pPr>
         <w:spacing w:before="120" w:after="240" w:line="360" w:lineRule="auto"/>
@@ -5479,11 +4790,7 @@
         <w:jc w:val="both"/>
       </w:pPr>
       <w:r>
-        <w:t xml:space="preserve">У ході роботи команда пройшла тест Белбіна та розподілила ролі: за результатами тесту моя провідна роль — організатор роботи, тому в команді я взяв на себе координацію: декомпозицію завдань на картки, призначення виконавців і контроль дедлайнів. У Trello створено дошку «Командна робота ЛР-3» зі списками «To Do», «In Progress», «Done», картками-завданнями, </w:t>
-      </w:r>
-      <w:r>
-        <w:lastRenderedPageBreak/>
-        <w:t>чеклістами, дедлайнами та коментарями від кожного учасника, а також продемонстровано переміщення картки за статусами.</w:t>
+        <w:t xml:space="preserve">У ході роботи команда пройшла тест Белбіна та розподілила ролі: за результатами тесту моя провідна роль — організатор роботи. У Trello на дошці «Командна робота ЛР-3» зі списками «To Do», «In progress», «Done» обране завдання «Мій ідеальний застосунок» розбито на три картки з призначеними учасниками та дедлайнами, а історія роботи збереглася у стрічці активності дошки.</w:t>
       </w:r>
     </w:p>
     <w:p>
@@ -5493,7 +4800,7 @@
         <w:jc w:val="both"/>
       </w:pPr>
       <w:r>
-        <w:t>Здобуто навички організації колективної роботи в онлайн-системі керування проєктами: структурування задач, візуалізація прогресу, асинхронна комунікація в коментарях. Основні труднощі виникли під час узгодження дедлайнів між учасниками та вибору критеріїв відбору ідей — їх вирішено обговоренням у коментарях картки. Робота дала змогу усвідомити власну схильність до координації та ухвалення рішень і побачити, що роль завершувача й дослідника ресурсів у команді має виконувати інший учасник.</w:t>
+        <w:t xml:space="preserve">Здобуто навички організації колективної роботи в онлайн-системі керування проєктами: структурування задач, розподіл виконавців, візуалізація прогресу. Основні труднощі — команда довго визначалася із завданням і заповнила дошку із запізненням, тому дедлайни карток виявилися простроченими, а коментарі, чеклісти й переміщення карток між списками майже не використовувалися. Надалі варто вести обговорення безпосередньо в картках і переносити їх між списками в міру виконання.</w:t>
       </w:r>
     </w:p>
     <w:sectPr>

</xml_diff>